<commit_message>
Growth: método v7 tras backtest fase 2 (51 casos neutrales ARKK, ajuste/validación), tanda 1 y 2 recalculadas con Word y PDF
Co-Authored-By: Claude Opus 5.5 (1M context) <noreply@anthropic.com>
Claude-Session: https://claude.ai/code/session_018kW9hjrkuR4xqe697jYx8Z
</commit_message>
<xml_diff>
--- a/informes-growth/argenx-2026-10-14/argenx - growth - 2026-10-14.docx
+++ b/informes-growth/argenx-2026-10-14/argenx - growth - 2026-10-14.docx
@@ -20,25 +20,25 @@
           <w:bCs/>
           <w:b/>
         </w:rPr>
-        <w:t xml:space="preserve">Señal (método v4): Mantener</w:t>
-      </w:r>
-      <w:r>
-        <w:t xml:space="preserve"> </w:t>
-      </w:r>
-      <w:r>
-        <w:t xml:space="preserve">(sin convicción; no está en vigilancia) · Puntuación 70,5/100 · Señales de cambio de tendencia 3/8 · EV/beneficio bruto 7,6x</w:t>
-      </w:r>
-      <w:r>
-        <w:t xml:space="preserve"> </w:t>
-      </w:r>
-      <w:r>
-        <w:t xml:space="preserve">Precio 817,16 USD (Nasdaq; 733,20 EUR en Bruselas) · Objetivo 12 m 1.190,8 USD (ponderada +45,7 %, base +40,8 %, bajista -37,2 %, alcista +138,5 %) · Compra hasta 1.082,5 USD</w:t>
-      </w:r>
-      <w:r>
-        <w:t xml:space="preserve"> </w:t>
-      </w:r>
-      <w:r>
-        <w:t xml:space="preserve">Peso orientativo: no entra · Por qué: no compra: menos de 4 señales</w:t>
+        <w:t xml:space="preserve">Señal (método v7): Comprar (convicción baja)</w:t>
+      </w:r>
+      <w:r>
+        <w:t xml:space="preserve"> </w:t>
+      </w:r>
+      <w:r>
+        <w:t xml:space="preserve">· Puntuación 70,5/100 · Señales de cambio de tendencia 3/8 · EV/beneficio bruto 7,6x</w:t>
+      </w:r>
+      <w:r>
+        <w:t xml:space="preserve"> </w:t>
+      </w:r>
+      <w:r>
+        <w:t xml:space="preserve">Precio 817,16 USD · Objetivo 12 m 1190,8 USD (ponderada +45,7 %, base +40,8 %, bajista -37,2 %, alcista +138,5 %) · Compra hasta 1134,1 USD</w:t>
+      </w:r>
+      <w:r>
+        <w:t xml:space="preserve"> </w:t>
+      </w:r>
+      <w:r>
+        <w:t xml:space="preserve">Peso orientativo: 3,5 % de la cartera · Por qué: cumple todos los requisitos de compra</w:t>
       </w:r>
     </w:p>
     <w:p>
@@ -50,47 +50,28 @@
           <w:bCs/>
           <w:b/>
         </w:rPr>
-        <w:t xml:space="preserve">Cotización usada: Nasdaq en USD.</w:t>
-      </w:r>
-      <w:r>
-        <w:t xml:space="preserve"> </w:t>
-      </w:r>
-      <w:r>
-        <w:t xml:space="preserve">argenx publica sus cuentas en USD, y las acciones diluidas, el BPA y el consenso están en USD. Así no hay que convertir divisas. El cierre de Bruselas (733,20 EUR el 12-oct; 722-745 EUR el 13-oct) da la misma valoración al tipo de cambio de hoy [3].</w:t>
-      </w:r>
-    </w:p>
-    <w:p>
-      <w:pPr>
-        <w:pStyle w:val="BlockText"/>
-      </w:pPr>
-      <w:r>
-        <w:rPr>
-          <w:bCs/>
-          <w:b/>
-        </w:rPr>
-        <w:t xml:space="preserve">Ojo con el objetivo.</w:t>
-      </w:r>
-      <w:r>
-        <w:t xml:space="preserve"> </w:t>
-      </w:r>
-      <w:r>
-        <w:t xml:space="preserve">La regla mecánica del método proyecta unas ventas base de 12.612 M USD dentro de 2 años. Parte de un crecimiento del 60 % (el tope de la regla) porque mezcla el CAGR de 2 años (+82 %) con el pasado. Pero argenx se está frenando con fuerza: +98 % en el 2T 2025, +60 % en el 2T 2026 y ~+41 % esperado en el 3T. El consenso para 2028 es de ~9.330 M USD [9].</w:t>
-      </w:r>
-      <w:r>
-        <w:t xml:space="preserve"> </w:t>
-      </w:r>
-      <w:r>
-        <w:rPr>
-          <w:bCs/>
-          <w:b/>
-        </w:rPr>
-        <w:t xml:space="preserve">Con nuestras ventas de analista (7.600 / 9.300 / 10.500 M) y los mismos múltiplos, la ponderada sería ~+11 % y la base ~+6,5 %.</w:t>
-      </w:r>
-      <w:r>
-        <w:t xml:space="preserve"> </w:t>
-      </w:r>
-      <w:r>
-        <w:t xml:space="preserve">Es la cifra más realista, y apenas pasa el listón. Ver el apartado 9 y la propuesta de mejora del final.</w:t>
+        <w:t xml:space="preserve">Calculado con el método v7</w:t>
+      </w:r>
+      <w:r>
+        <w:t xml:space="preserve"> </w:t>
+      </w:r>
+      <w:r>
+        <w:t xml:space="preserve">(vigente desde el 14-oct tras el backtest de 71 casos,</w:t>
+      </w:r>
+      <w:r>
+        <w:t xml:space="preserve"> </w:t>
+      </w:r>
+      <w:r>
+        <w:rPr>
+          <w:rStyle w:val="VerbatimChar"/>
+        </w:rPr>
+        <w:t xml:space="preserve">verticales/growth/metodo.md</w:t>
+      </w:r>
+      <w:r>
+        <w:t xml:space="preserve"> </w:t>
+      </w:r>
+      <w:r>
+        <w:t xml:space="preserve">§6). Si la sección 9 enseña otras cifras de valoración, son del borrador con la proyección del analista; mandan las de arriba: ventas con la regla mecánica (12612 M en el base) y múltiplo de hoy con rebaja por desaceleración (3,4x / 5,6x / 8,5x).</w:t>
       </w:r>
     </w:p>
     <w:bookmarkStart w:id="20" w:name="la-tesis-en-cinco-líneas"/>

</xml_diff>

<commit_message>
Growth: quitados los importes de cartera que quedaban en 33 informes y en cartera-growth.md; Word y PDF regenerados desde las fuentes limpias
Co-Authored-By: Claude Opus 5.5 (1M context) <noreply@anthropic.com>
Claude-Session: https://claude.ai/code/session_01JDm5vWiBcw9E9BcFQ2kMdJ
</commit_message>
<xml_diff>
--- a/informes-growth/argenx-2026-10-14/argenx - growth - 2026-10-14.docx
+++ b/informes-growth/argenx-2026-10-14/argenx - growth - 2026-10-14.docx
@@ -3676,7 +3676,7 @@
         <w:pStyle w:val="FirstParagraph"/>
       </w:pPr>
       <w:r>
-        <w:t xml:space="preserve">Cartera value propuesta de Hotis (~29.800 EUR): IGLN (oro), Edenred, Daiichi Sankyo, Uber, Viscofan, Alphabet, Netflix, SAP, Intuit, Nemetschek, LVMH y ~6.300 EUR de liquidez. Growth ya analizadas: Palantir, CrowdStrike, Spotify y Rheinmetall, ninguna en Comprar. El bolsillo growth podría llegar al 20 % (~5.960 EUR), con posiciones del 3,5-5 % (~1.040-1.490 EUR).</w:t>
+        <w:t xml:space="preserve">Cartera value propuesta de Hotis : IGLN (oro), Edenred, Daiichi Sankyo, Uber, Viscofan, Alphabet, Netflix, SAP, Intuit, Nemetschek, LVMH y liquidez. Growth ya analizadas: Palantir, CrowdStrike, Spotify y Rheinmetall, ninguna en Comprar. El bolsillo growth podría llegar al 20 %, con posiciones del 3,5-5 % (~1.040-.</w:t>
       </w:r>
     </w:p>
     <w:p>
@@ -3709,7 +3709,7 @@
         <w:t xml:space="preserve">Plan si gira</w:t>
       </w:r>
       <w:r>
-        <w:t xml:space="preserve">: si tras los resultados del 3T (22-oct) o la lectura de EMPASSION recupera la media de 200 sesiones (~850-880 USD) y el sentimiento se estabiliza, tendría 4-5 señales y pasaría a Comprar con convicción baja. Peso del 3,5 % (~1.040 EUR) a costa de la liquidez, en dos tramos: la mitad al confirmarse la señal y la otra mitad tras los resultados del 4T (feb-2027) o con una caída del 10 % sin cambio de tesis. Precio máximo de compra según la regla: 1.082,5 USD. Con la proyección realista, conviene no pasar de ~900 USD. Comprando en Bruselas en EUR se evita el ADR y la conversión de divisas.</w:t>
+        <w:t xml:space="preserve">: si tras los resultados del 3T (22-oct) o la lectura de EMPASSION recupera la media de 200 sesiones (~850-880 USD) y el sentimiento se estabiliza, tendría 4-5 señales y pasaría a Comprar con convicción baja. Peso del 3,5 % a costa de la liquidez, en dos tramos: la mitad al confirmarse la señal y la otra mitad tras los resultados del 4T (feb-2027) o con una caída del 10 % sin cambio de tesis. Precio máximo de compra según la regla: 1.082,5 USD. Con la proyección realista, conviene no pasar de ~900 USD. Comprando en Bruselas en EUR se evita el ADR y la conversión de divisas.</w:t>
       </w:r>
     </w:p>
     <w:bookmarkEnd w:id="32"/>

</xml_diff>

<commit_message>
Growth: cabeceras de 32 informes rehechas con la v11 vigente (auditoría de homogeneidad); Word y PDF regenerados
Cambian de señal: HubSpot, Wise y Eli Lilly (Comprar -> Mantener) y Comfort Systems (Mantener -> Vender).

Co-Authored-By: Claude Opus 5.5 (1M context) <noreply@anthropic.com>
Claude-Session: https://claude.ai/code/session_01JDm5vWiBcw9E9BcFQ2kMdJ
</commit_message>
<xml_diff>
--- a/informes-growth/argenx-2026-10-14/argenx - growth - 2026-10-14.docx
+++ b/informes-growth/argenx-2026-10-14/argenx - growth - 2026-10-14.docx
@@ -20,58 +20,31 @@
           <w:bCs/>
           <w:b/>
         </w:rPr>
-        <w:t xml:space="preserve">Señal (método v7): Comprar (convicción baja)</w:t>
-      </w:r>
-      <w:r>
-        <w:t xml:space="preserve"> </w:t>
-      </w:r>
-      <w:r>
-        <w:t xml:space="preserve">· Puntuación 70,5/100 · Señales de cambio de tendencia 3/8 · EV/beneficio bruto 7,6x</w:t>
-      </w:r>
-      <w:r>
-        <w:t xml:space="preserve"> </w:t>
-      </w:r>
-      <w:r>
-        <w:t xml:space="preserve">Precio 817,16 USD · Objetivo 12 m 1190,8 USD (ponderada +45,7 %, base +40,8 %, bajista -37,2 %, alcista +138,5 %) · Compra hasta 1134,1 USD</w:t>
-      </w:r>
-      <w:r>
-        <w:t xml:space="preserve"> </w:t>
-      </w:r>
-      <w:r>
-        <w:t xml:space="preserve">Peso orientativo: 3,5 % de la cartera · Por qué: cumple todos los requisitos de compra</w:t>
-      </w:r>
-    </w:p>
-    <w:p>
-      <w:pPr>
-        <w:pStyle w:val="BlockText"/>
-      </w:pPr>
-      <w:r>
-        <w:rPr>
-          <w:bCs/>
-          <w:b/>
-        </w:rPr>
-        <w:t xml:space="preserve">Calculado con el método v7</w:t>
-      </w:r>
-      <w:r>
-        <w:t xml:space="preserve"> </w:t>
-      </w:r>
-      <w:r>
-        <w:t xml:space="preserve">(vigente desde el 14-oct tras el backtest de 71 casos,</w:t>
-      </w:r>
-      <w:r>
-        <w:t xml:space="preserve"> </w:t>
-      </w:r>
-      <w:r>
-        <w:rPr>
-          <w:rStyle w:val="VerbatimChar"/>
-        </w:rPr>
-        <w:t xml:space="preserve">verticales/growth/metodo.md</w:t>
-      </w:r>
-      <w:r>
-        <w:t xml:space="preserve"> </w:t>
-      </w:r>
-      <w:r>
-        <w:t xml:space="preserve">§6). Si la sección 9 enseña otras cifras de valoración, son del borrador con la proyección del analista; mandan las de arriba: ventas con la regla mecánica (12612 M en el base) y múltiplo de hoy con rebaja por desaceleración (3,4x / 5,6x / 8,5x).</w:t>
+        <w:t xml:space="preserve">Señal (método vigente v11): Comprar (convicción baja)</w:t>
+      </w:r>
+      <w:r>
+        <w:t xml:space="preserve"> </w:t>
+      </w:r>
+      <w:r>
+        <w:t xml:space="preserve">· Puntuación 70,5/100 · Señales de cambio de tendencia 3/8 · EV/ventas NTM 6,9 veces</w:t>
+      </w:r>
+      <w:r>
+        <w:t xml:space="preserve"> </w:t>
+      </w:r>
+      <w:r>
+        <w:t xml:space="preserve">Precio 817,16 USD (fecha del informe) · Objetivo 12 m 910,1 USD · Ponderada +11,4 % · Base +6,4 % · Bajista −42,9 % · Alcista +75,7 % · Compra hasta 866,8 USD</w:t>
+      </w:r>
+      <w:r>
+        <w:t xml:space="preserve"> </w:t>
+      </w:r>
+      <w:r>
+        <w:t xml:space="preserve">Peso orientativo: 3.5 % de la cartera · Por qué: cumple todos los requisitos de compra</w:t>
+      </w:r>
+      <w:r>
+        <w:t xml:space="preserve"> </w:t>
+      </w:r>
+      <w:r>
+        <w:t xml:space="preserve">Cabecera rehecha con la v11 el 15-oct (auditoría de homogeneidad). Antes decía (método v7): Comprar (convicción baja). El texto de abajo puede citar cifras de esa versión anterior; mandan las de esta cabecera.</w:t>
       </w:r>
     </w:p>
     <w:bookmarkStart w:id="20" w:name="la-tesis-en-cinco-líneas"/>

</xml_diff>